<commit_message>
nuevo backend + documentacion de este 1
</commit_message>
<xml_diff>
--- a/entregas/Choque de Realidad primer informe celso proyecto autos.docx
+++ b/entregas/Choque de Realidad primer informe celso proyecto autos.docx
@@ -4540,21 +4540,7 @@
                 <w:rStyle w:val="Hipervnculo"/>
                 <w:noProof/>
               </w:rPr>
-              <w:t>XIV.iii R</w:t>
-            </w:r>
-            <w:r>
-              <w:rPr>
-                <w:rStyle w:val="Hipervnculo"/>
-                <w:noProof/>
-              </w:rPr>
-              <w:t>e</w:t>
-            </w:r>
-            <w:r>
-              <w:rPr>
-                <w:rStyle w:val="Hipervnculo"/>
-                <w:noProof/>
-              </w:rPr>
-              <w:t>producibilidad y Uso</w:t>
+              <w:t>XIV.iii Reproducibilidad y Uso</w:t>
             </w:r>
             <w:r>
               <w:rPr>
@@ -5901,13 +5887,7 @@
       </w:r>
       <w:proofErr w:type="spellEnd"/>
       <w:r>
-        <w:t xml:space="preserve">, así como la normalización de variables numéricas. Estas transformaciones resultan esenciales para adaptar los datos a los requerimientos de los algoritmos de aprendizaje supervisado, evitando sesgos y mejorando la estabilidad del entrenamiento. Así se describe en `Una introducción al </w:t>
-      </w:r>
-      <w:r>
-        <w:t>aprendizaje</w:t>
-      </w:r>
-      <w:r>
-        <w:t xml:space="preserve"> estadístico`. </w:t>
+        <w:t xml:space="preserve">, así como la normalización de variables numéricas. Estas transformaciones resultan esenciales para adaptar los datos a los requerimientos de los algoritmos de aprendizaje supervisado, evitando sesgos y mejorando la estabilidad del entrenamiento. Así se describe en `Una introducción al aprendizaje estadístico`. </w:t>
       </w:r>
       <w:sdt>
         <w:sdtPr>
@@ -6027,14 +6007,7 @@
         <w:rPr>
           <w:bCs/>
         </w:rPr>
-        <w:t xml:space="preserve">tanto para los datos procesados como para los modelos entrenados </w:t>
-      </w:r>
-      <w:proofErr w:type="gramStart"/>
-      <w:r>
-        <w:rPr>
-          <w:bCs/>
-        </w:rPr>
-        <w:t>o .</w:t>
+        <w:t>tanto para los datos procesados como para los modelos entrenados o .</w:t>
       </w:r>
       <w:proofErr w:type="spellStart"/>
       <w:r>
@@ -6044,7 +6017,6 @@
         <w:t>pkl</w:t>
       </w:r>
       <w:proofErr w:type="spellEnd"/>
-      <w:proofErr w:type="gramEnd"/>
       <w:r>
         <w:rPr>
           <w:bCs/>
@@ -6741,7 +6713,7 @@
         </w:rPr>
         <w:t xml:space="preserve">: </w:t>
       </w:r>
-      <w:hyperlink r:id="rId6" w:history="1">
+      <w:hyperlink r:id="rId8" w:history="1">
         <w:r>
           <w:rPr>
             <w:rStyle w:val="Hipervnculo"/>
@@ -6832,300 +6804,292 @@
       </w:r>
       <w:proofErr w:type="spellEnd"/>
       <w:r>
-        <w:t xml:space="preserve"> contiene una variable </w:t>
-      </w:r>
-      <w:proofErr w:type="gramStart"/>
-      <w:r>
-        <w:t>objetivo clara</w:t>
-      </w:r>
-      <w:proofErr w:type="gramEnd"/>
+        <w:t xml:space="preserve"> contiene una variable objetivo clara (`</w:t>
+      </w:r>
+      <w:proofErr w:type="spellStart"/>
+      <w:r>
+        <w:t>price</w:t>
+      </w:r>
+      <w:proofErr w:type="spellEnd"/>
+      <w:r>
+        <w:t>`) directamente alineada con el problema de negocio; la estimación del valor de un vehículo. En segundo lugar, incorpora un conjunto amplio y diverso de variables predictoras, tales como:</w:t>
+      </w:r>
+    </w:p>
+    <w:p>
+      <w:pPr>
+        <w:ind w:firstLine="360"/>
+        <w:jc w:val="both"/>
+      </w:pPr>
+      <w:r>
+        <w:t xml:space="preserve">- </w:t>
+      </w:r>
+      <w:r>
+        <w:rPr>
+          <w:b/>
+          <w:bCs/>
+        </w:rPr>
+        <w:t>características técnicas</w:t>
+      </w:r>
       <w:r>
         <w:t xml:space="preserve"> (`</w:t>
       </w:r>
       <w:proofErr w:type="spellStart"/>
       <w:r>
+        <w:t>year</w:t>
+      </w:r>
+      <w:proofErr w:type="spellEnd"/>
+      <w:r>
+        <w:t>`, `</w:t>
+      </w:r>
+      <w:proofErr w:type="spellStart"/>
+      <w:r>
+        <w:t>cylinders</w:t>
+      </w:r>
+      <w:proofErr w:type="spellEnd"/>
+      <w:r>
+        <w:t>`, `fuel`)</w:t>
+      </w:r>
+    </w:p>
+    <w:p>
+      <w:pPr>
+        <w:ind w:firstLine="360"/>
+        <w:jc w:val="both"/>
+      </w:pPr>
+      <w:r>
+        <w:t xml:space="preserve">- </w:t>
+      </w:r>
+      <w:r>
+        <w:rPr>
+          <w:b/>
+          <w:bCs/>
+        </w:rPr>
+        <w:t xml:space="preserve">características de uso </w:t>
+      </w:r>
+      <w:r>
+        <w:t>(`</w:t>
+      </w:r>
+      <w:proofErr w:type="spellStart"/>
+      <w:r>
+        <w:t>odometer</w:t>
+      </w:r>
+      <w:proofErr w:type="spellEnd"/>
+      <w:r>
+        <w:t>`)</w:t>
+      </w:r>
+    </w:p>
+    <w:p>
+      <w:pPr>
+        <w:ind w:firstLine="360"/>
+        <w:jc w:val="both"/>
+      </w:pPr>
+      <w:r>
+        <w:rPr>
+          <w:b/>
+          <w:bCs/>
+        </w:rPr>
+        <w:t xml:space="preserve">- atributos categóricos </w:t>
+      </w:r>
+      <w:r>
+        <w:t>(`</w:t>
+      </w:r>
+      <w:proofErr w:type="spellStart"/>
+      <w:r>
+        <w:t>manufacturer</w:t>
+      </w:r>
+      <w:proofErr w:type="spellEnd"/>
+      <w:r>
+        <w:t>`, `</w:t>
+      </w:r>
+      <w:proofErr w:type="spellStart"/>
+      <w:r>
+        <w:t>model</w:t>
+      </w:r>
+      <w:proofErr w:type="spellEnd"/>
+      <w:r>
+        <w:t>`, `</w:t>
+      </w:r>
+      <w:proofErr w:type="spellStart"/>
+      <w:r>
+        <w:t>type</w:t>
+      </w:r>
+      <w:proofErr w:type="spellEnd"/>
+      <w:r>
+        <w:t>`)</w:t>
+      </w:r>
+    </w:p>
+    <w:p>
+      <w:pPr>
+        <w:ind w:firstLine="360"/>
+        <w:jc w:val="both"/>
+      </w:pPr>
+      <w:r>
+        <w:t>Permitiendo modelar el problema desde múltiples dimensiones.</w:t>
+      </w:r>
+    </w:p>
+    <w:p>
+      <w:pPr>
+        <w:ind w:firstLine="360"/>
+        <w:jc w:val="both"/>
+      </w:pPr>
+      <w:r>
+        <w:t xml:space="preserve">Adicionalmente, el tamaño del </w:t>
+      </w:r>
+      <w:proofErr w:type="spellStart"/>
+      <w:r>
+        <w:t>dataset</w:t>
+      </w:r>
+      <w:proofErr w:type="spellEnd"/>
+      <w:r>
+        <w:t xml:space="preserve"> (más de 400.000 registros iniciales) proporciona suficiente volumen de información para entrenar modelos robustos y reducir el riesgo de sobreajuste.</w:t>
+      </w:r>
+    </w:p>
+    <w:p>
+      <w:pPr>
+        <w:ind w:firstLine="360"/>
+        <w:jc w:val="both"/>
+      </w:pPr>
+      <w:r>
+        <w:t>Asimismo, su uso también implica desafíos:</w:t>
+      </w:r>
+    </w:p>
+    <w:p>
+      <w:pPr>
+        <w:ind w:firstLine="360"/>
+        <w:jc w:val="both"/>
+        <w:rPr>
+          <w:b/>
+          <w:bCs/>
+        </w:rPr>
+      </w:pPr>
+      <w:r>
+        <w:rPr>
+          <w:b/>
+          <w:bCs/>
+        </w:rPr>
+        <w:t>- alta presencia de valores faltantes</w:t>
+      </w:r>
+    </w:p>
+    <w:p>
+      <w:pPr>
+        <w:ind w:firstLine="360"/>
+        <w:jc w:val="both"/>
+        <w:rPr>
+          <w:b/>
+          <w:bCs/>
+        </w:rPr>
+      </w:pPr>
+      <w:r>
+        <w:rPr>
+          <w:b/>
+          <w:bCs/>
+        </w:rPr>
+        <w:t>- variables con alta cardinalidad, como `</w:t>
+      </w:r>
+      <w:proofErr w:type="spellStart"/>
+      <w:r>
+        <w:rPr>
+          <w:b/>
+          <w:bCs/>
+        </w:rPr>
+        <w:t>model</w:t>
+      </w:r>
+      <w:proofErr w:type="spellEnd"/>
+      <w:r>
+        <w:rPr>
+          <w:b/>
+          <w:bCs/>
+        </w:rPr>
+        <w:t>`</w:t>
+      </w:r>
+    </w:p>
+    <w:p>
+      <w:pPr>
+        <w:ind w:firstLine="360"/>
+        <w:jc w:val="both"/>
+        <w:rPr>
+          <w:b/>
+          <w:bCs/>
+        </w:rPr>
+      </w:pPr>
+      <w:r>
+        <w:rPr>
+          <w:b/>
+          <w:bCs/>
+        </w:rPr>
+        <w:t>- ruido inherente a datos reales</w:t>
+      </w:r>
+    </w:p>
+    <w:p>
+      <w:pPr>
+        <w:ind w:firstLine="360"/>
+        <w:jc w:val="both"/>
+      </w:pPr>
+    </w:p>
+    <w:p>
+      <w:pPr>
+        <w:ind w:firstLine="360"/>
+        <w:jc w:val="both"/>
+      </w:pPr>
+      <w:r>
+        <w:t xml:space="preserve">Lejos de ser una desventaja absoluta, estos elementos convierten al </w:t>
+      </w:r>
+      <w:proofErr w:type="spellStart"/>
+      <w:r>
+        <w:t>dataset</w:t>
+      </w:r>
+      <w:proofErr w:type="spellEnd"/>
+      <w:r>
+        <w:t xml:space="preserve"> en un escenario realista, donde las decisiones de preprocesamiento y modelamiento adquieren un rol fundamental.</w:t>
+      </w:r>
+    </w:p>
+    <w:p>
+      <w:pPr>
+        <w:ind w:firstLine="360"/>
+        <w:jc w:val="both"/>
+      </w:pPr>
+      <w:r>
+        <w:t xml:space="preserve">La pertinencia del </w:t>
+      </w:r>
+      <w:proofErr w:type="spellStart"/>
+      <w:r>
+        <w:t>dataset</w:t>
+      </w:r>
+      <w:proofErr w:type="spellEnd"/>
+      <w:r>
+        <w:t xml:space="preserve"> es absoluta: contiene directamente nuestra variable objetivo (`</w:t>
+      </w:r>
+      <w:proofErr w:type="spellStart"/>
+      <w:r>
         <w:t>price</w:t>
       </w:r>
       <w:proofErr w:type="spellEnd"/>
       <w:r>
-        <w:t>`) directamente alineada con el problema de negocio; la estimación del valor de un vehículo. En segundo lugar, incorpora un conjunto amplio y diverso de variables predictoras, tales como:</w:t>
-      </w:r>
-    </w:p>
-    <w:p>
-      <w:pPr>
-        <w:ind w:firstLine="360"/>
-        <w:jc w:val="both"/>
-      </w:pPr>
-      <w:r>
-        <w:t xml:space="preserve">- </w:t>
-      </w:r>
-      <w:r>
-        <w:rPr>
-          <w:b/>
-          <w:bCs/>
-        </w:rPr>
-        <w:t>características técnicas</w:t>
-      </w:r>
-      <w:r>
-        <w:t xml:space="preserve"> (`</w:t>
-      </w:r>
-      <w:proofErr w:type="spellStart"/>
-      <w:r>
-        <w:t>year</w:t>
-      </w:r>
-      <w:proofErr w:type="spellEnd"/>
-      <w:r>
-        <w:t>`, `</w:t>
-      </w:r>
-      <w:proofErr w:type="spellStart"/>
-      <w:r>
-        <w:t>cylinders</w:t>
-      </w:r>
-      <w:proofErr w:type="spellEnd"/>
-      <w:r>
-        <w:t>`, `fuel`)</w:t>
-      </w:r>
-    </w:p>
-    <w:p>
-      <w:pPr>
-        <w:ind w:firstLine="360"/>
-        <w:jc w:val="both"/>
-      </w:pPr>
-      <w:r>
-        <w:t xml:space="preserve">- </w:t>
-      </w:r>
-      <w:r>
-        <w:rPr>
-          <w:b/>
-          <w:bCs/>
-        </w:rPr>
-        <w:t xml:space="preserve">características de uso </w:t>
-      </w:r>
-      <w:r>
-        <w:t>(`</w:t>
-      </w:r>
-      <w:proofErr w:type="spellStart"/>
-      <w:r>
-        <w:t>odometer</w:t>
-      </w:r>
-      <w:proofErr w:type="spellEnd"/>
-      <w:r>
-        <w:t>`)</w:t>
-      </w:r>
-    </w:p>
-    <w:p>
-      <w:pPr>
-        <w:ind w:firstLine="360"/>
-        <w:jc w:val="both"/>
-      </w:pPr>
-      <w:r>
-        <w:rPr>
-          <w:b/>
-          <w:bCs/>
-        </w:rPr>
-        <w:t xml:space="preserve">- atributos categóricos </w:t>
-      </w:r>
-      <w:r>
-        <w:t>(`</w:t>
-      </w:r>
-      <w:proofErr w:type="spellStart"/>
-      <w:r>
-        <w:t>manufacturer</w:t>
-      </w:r>
-      <w:proofErr w:type="spellEnd"/>
-      <w:r>
-        <w:t>`, `</w:t>
-      </w:r>
-      <w:proofErr w:type="spellStart"/>
-      <w:r>
-        <w:t>model</w:t>
-      </w:r>
-      <w:proofErr w:type="spellEnd"/>
-      <w:r>
-        <w:t>`, `</w:t>
-      </w:r>
-      <w:proofErr w:type="spellStart"/>
-      <w:r>
-        <w:t>type</w:t>
-      </w:r>
-      <w:proofErr w:type="spellEnd"/>
-      <w:r>
-        <w:t>`)</w:t>
-      </w:r>
-    </w:p>
-    <w:p>
-      <w:pPr>
-        <w:ind w:firstLine="360"/>
-        <w:jc w:val="both"/>
-      </w:pPr>
-      <w:r>
-        <w:t>Permitiendo modelar el problema desde múltiples dimensiones.</w:t>
-      </w:r>
-    </w:p>
-    <w:p>
-      <w:pPr>
-        <w:ind w:firstLine="360"/>
-        <w:jc w:val="both"/>
-      </w:pPr>
-      <w:r>
-        <w:t xml:space="preserve">Adicionalmente, el tamaño del </w:t>
-      </w:r>
-      <w:proofErr w:type="spellStart"/>
-      <w:r>
+        <w:t>`) y una pluralidad de variables independientes, permitiendo que un algoritmo establezca la topología multidimensional que relaciona las cualidades físicas de un automóvil con su valor monetario temporal.</w:t>
+      </w:r>
+    </w:p>
+    <w:p>
+      <w:pPr>
+        <w:ind w:firstLine="360"/>
+        <w:jc w:val="both"/>
+      </w:pPr>
+      <w:r>
+        <w:rPr>
+          <w:i/>
+        </w:rPr>
+        <w:t xml:space="preserve">Ningún </w:t>
+      </w:r>
+      <w:proofErr w:type="spellStart"/>
+      <w:r>
+        <w:rPr>
+          <w:i/>
+        </w:rPr>
         <w:t>dataset</w:t>
       </w:r>
       <w:proofErr w:type="spellEnd"/>
       <w:r>
-        <w:t xml:space="preserve"> (más de 400.000 registros iniciales) proporciona suficiente volumen de información para entrenar modelos robustos y reducir el riesgo de sobreajuste.</w:t>
-      </w:r>
-    </w:p>
-    <w:p>
-      <w:pPr>
-        <w:ind w:firstLine="360"/>
-        <w:jc w:val="both"/>
-      </w:pPr>
-      <w:r>
-        <w:t>Asimismo, su uso también implica desafíos:</w:t>
-      </w:r>
-    </w:p>
-    <w:p>
-      <w:pPr>
-        <w:ind w:firstLine="360"/>
-        <w:jc w:val="both"/>
-        <w:rPr>
-          <w:b/>
-          <w:bCs/>
-        </w:rPr>
-      </w:pPr>
-      <w:r>
-        <w:rPr>
-          <w:b/>
-          <w:bCs/>
-        </w:rPr>
-        <w:t>- alta presencia de valores faltantes</w:t>
-      </w:r>
-    </w:p>
-    <w:p>
-      <w:pPr>
-        <w:ind w:firstLine="360"/>
-        <w:jc w:val="both"/>
-        <w:rPr>
-          <w:b/>
-          <w:bCs/>
-        </w:rPr>
-      </w:pPr>
-      <w:r>
-        <w:rPr>
-          <w:b/>
-          <w:bCs/>
-        </w:rPr>
-        <w:t>- variables con alta cardinalidad, como `</w:t>
-      </w:r>
-      <w:proofErr w:type="spellStart"/>
-      <w:r>
-        <w:rPr>
-          <w:b/>
-          <w:bCs/>
-        </w:rPr>
-        <w:t>model</w:t>
-      </w:r>
-      <w:proofErr w:type="spellEnd"/>
-      <w:r>
-        <w:rPr>
-          <w:b/>
-          <w:bCs/>
-        </w:rPr>
-        <w:t>`</w:t>
-      </w:r>
-    </w:p>
-    <w:p>
-      <w:pPr>
-        <w:ind w:firstLine="360"/>
-        <w:jc w:val="both"/>
-        <w:rPr>
-          <w:b/>
-          <w:bCs/>
-        </w:rPr>
-      </w:pPr>
-      <w:r>
-        <w:rPr>
-          <w:b/>
-          <w:bCs/>
-        </w:rPr>
-        <w:t>- ruido inherente a datos reales</w:t>
-      </w:r>
-    </w:p>
-    <w:p>
-      <w:pPr>
-        <w:ind w:firstLine="360"/>
-        <w:jc w:val="both"/>
-      </w:pPr>
-    </w:p>
-    <w:p>
-      <w:pPr>
-        <w:ind w:firstLine="360"/>
-        <w:jc w:val="both"/>
-      </w:pPr>
-      <w:r>
-        <w:t xml:space="preserve">Lejos de ser una desventaja absoluta, estos elementos convierten al </w:t>
-      </w:r>
-      <w:proofErr w:type="spellStart"/>
-      <w:r>
-        <w:t>dataset</w:t>
-      </w:r>
-      <w:proofErr w:type="spellEnd"/>
-      <w:r>
-        <w:t xml:space="preserve"> en un escenario realista, donde las decisiones de preprocesamiento y modelamiento adquieren un rol fundamental.</w:t>
-      </w:r>
-    </w:p>
-    <w:p>
-      <w:pPr>
-        <w:ind w:firstLine="360"/>
-        <w:jc w:val="both"/>
-      </w:pPr>
-      <w:r>
-        <w:t xml:space="preserve">La pertinencia del </w:t>
-      </w:r>
-      <w:proofErr w:type="spellStart"/>
-      <w:r>
-        <w:t>dataset</w:t>
-      </w:r>
-      <w:proofErr w:type="spellEnd"/>
-      <w:r>
-        <w:t xml:space="preserve"> es absoluta: contiene directamente nuestra variable objetivo (`</w:t>
-      </w:r>
-      <w:proofErr w:type="spellStart"/>
-      <w:r>
-        <w:t>price</w:t>
-      </w:r>
-      <w:proofErr w:type="spellEnd"/>
-      <w:r>
-        <w:t>`) y una pluralidad de variables independientes, permitiendo que un algoritmo establezca la topología multidimensional que relaciona las cualidades físicas de un automóvil con su valor monetario temporal.</w:t>
-      </w:r>
-    </w:p>
-    <w:p>
-      <w:pPr>
-        <w:ind w:firstLine="360"/>
-        <w:jc w:val="both"/>
-      </w:pPr>
-      <w:r>
         <w:rPr>
           <w:i/>
         </w:rPr>
-        <w:t xml:space="preserve">Ningún </w:t>
-      </w:r>
-      <w:proofErr w:type="spellStart"/>
-      <w:r>
-        <w:rPr>
-          <w:i/>
-        </w:rPr>
-        <w:t>dataset</w:t>
-      </w:r>
-      <w:proofErr w:type="spellEnd"/>
-      <w:r>
-        <w:rPr>
-          <w:i/>
-        </w:rPr>
         <w:t xml:space="preserve"> es perfecto, se trata de ser suficientemente complejo y rico como para exigir un modelo que realmente comprenda la realidad que intenta predecir.</w:t>
       </w:r>
     </w:p>
@@ -7361,21 +7325,7 @@
         <w:rPr>
           <w:bCs/>
         </w:rPr>
-        <w:t xml:space="preserve">Desarrollo paralelo de múltiples arquitecturas, las cuales se </w:t>
-      </w:r>
-      <w:proofErr w:type="gramStart"/>
-      <w:r>
-        <w:rPr>
-          <w:bCs/>
-        </w:rPr>
-        <w:t>mencionaran</w:t>
-      </w:r>
-      <w:proofErr w:type="gramEnd"/>
-      <w:r>
-        <w:rPr>
-          <w:bCs/>
-        </w:rPr>
-        <w:t xml:space="preserve"> </w:t>
+        <w:t xml:space="preserve">Desarrollo paralelo de múltiples arquitecturas, las cuales se mencionaran </w:t>
       </w:r>
       <w:proofErr w:type="spellStart"/>
       <w:r>
@@ -7389,21 +7339,7 @@
         <w:rPr>
           <w:bCs/>
         </w:rPr>
-        <w:t xml:space="preserve"> adelante en el presente documento; sin </w:t>
-      </w:r>
-      <w:proofErr w:type="gramStart"/>
-      <w:r>
-        <w:rPr>
-          <w:bCs/>
-        </w:rPr>
-        <w:t>spoilers</w:t>
-      </w:r>
-      <w:proofErr w:type="gramEnd"/>
-      <w:r>
-        <w:rPr>
-          <w:bCs/>
-        </w:rPr>
-        <w:t xml:space="preserve"> por ahora.</w:t>
+        <w:t xml:space="preserve"> adelante en el presente documento; sin spoilers por ahora.</w:t>
       </w:r>
     </w:p>
     <w:p>
@@ -7488,14 +7424,7 @@
         <w:rPr>
           <w:bCs/>
         </w:rPr>
-        <w:t xml:space="preserve">La planificación estructuró el trabajo en fases progresivas documentadas en cuadernos tipo </w:t>
-      </w:r>
-      <w:proofErr w:type="gramStart"/>
-      <w:r>
-        <w:rPr>
-          <w:bCs/>
-        </w:rPr>
-        <w:t>`.</w:t>
+        <w:t>La planificación estructuró el trabajo en fases progresivas documentadas en cuadernos tipo `.</w:t>
       </w:r>
       <w:proofErr w:type="spellStart"/>
       <w:r>
@@ -7505,7 +7434,6 @@
         <w:t>ipyne</w:t>
       </w:r>
       <w:proofErr w:type="spellEnd"/>
-      <w:proofErr w:type="gramEnd"/>
       <w:r>
         <w:rPr>
           <w:bCs/>
@@ -8729,7 +8657,7 @@
                     </pic:cNvPicPr>
                   </pic:nvPicPr>
                   <pic:blipFill>
-                    <a:blip r:embed="rId7">
+                    <a:blip r:embed="rId9">
                       <a:extLst>
                         <a:ext uri="{28A0092B-C50C-407E-A947-70E740481C1C}">
                           <a14:useLocalDpi xmlns:a14="http://schemas.microsoft.com/office/drawing/2010/main" val="0"/>
@@ -8799,7 +8727,7 @@
                     </pic:cNvPicPr>
                   </pic:nvPicPr>
                   <pic:blipFill>
-                    <a:blip r:embed="rId8">
+                    <a:blip r:embed="rId10">
                       <a:extLst>
                         <a:ext uri="{28A0092B-C50C-407E-A947-70E740481C1C}">
                           <a14:useLocalDpi xmlns:a14="http://schemas.microsoft.com/office/drawing/2010/main" val="0"/>
@@ -8870,7 +8798,7 @@
                     </pic:cNvPicPr>
                   </pic:nvPicPr>
                   <pic:blipFill>
-                    <a:blip r:embed="rId9">
+                    <a:blip r:embed="rId11">
                       <a:extLst>
                         <a:ext uri="{28A0092B-C50C-407E-A947-70E740481C1C}">
                           <a14:useLocalDpi xmlns:a14="http://schemas.microsoft.com/office/drawing/2010/main" val="0"/>
@@ -8950,7 +8878,7 @@
                     </pic:cNvPicPr>
                   </pic:nvPicPr>
                   <pic:blipFill>
-                    <a:blip r:embed="rId10">
+                    <a:blip r:embed="rId12">
                       <a:extLst>
                         <a:ext uri="{28A0092B-C50C-407E-A947-70E740481C1C}">
                           <a14:useLocalDpi xmlns:a14="http://schemas.microsoft.com/office/drawing/2010/main" val="0"/>
@@ -9095,17 +9023,8 @@
           <w:b/>
           <w:bCs/>
         </w:rPr>
-        <w:t xml:space="preserve">- Las marcas dominantes concentran la mayoría de </w:t>
-      </w:r>
-      <w:proofErr w:type="gramStart"/>
-      <w:r>
-        <w:rPr>
-          <w:b/>
-          <w:bCs/>
-        </w:rPr>
-        <w:t>registros</w:t>
-      </w:r>
-      <w:proofErr w:type="gramEnd"/>
+        <w:t>- Las marcas dominantes concentran la mayoría de registros</w:t>
+      </w:r>
     </w:p>
     <w:p>
       <w:pPr>
@@ -9438,6 +9357,54 @@
         </w:rPr>
         <w:t>Porque a veces lo esencial es invisible a los ojos</w:t>
       </w:r>
+      <w:sdt>
+        <w:sdtPr>
+          <w:rPr>
+            <w:i/>
+          </w:rPr>
+          <w:id w:val="1356305733"/>
+          <w:citation/>
+        </w:sdtPr>
+        <w:sdtContent>
+          <w:r>
+            <w:rPr>
+              <w:i/>
+            </w:rPr>
+            <w:fldChar w:fldCharType="begin"/>
+          </w:r>
+          <w:r>
+            <w:rPr>
+              <w:i/>
+            </w:rPr>
+            <w:instrText xml:space="preserve"> CITATION Sai43 \l 13322 </w:instrText>
+          </w:r>
+          <w:r>
+            <w:rPr>
+              <w:i/>
+            </w:rPr>
+            <w:fldChar w:fldCharType="separate"/>
+          </w:r>
+          <w:r>
+            <w:rPr>
+              <w:i/>
+              <w:noProof/>
+            </w:rPr>
+            <w:t xml:space="preserve"> </w:t>
+          </w:r>
+          <w:r>
+            <w:rPr>
+              <w:noProof/>
+            </w:rPr>
+            <w:t>(Saint-Exupéry, 1943)</w:t>
+          </w:r>
+          <w:r>
+            <w:rPr>
+              <w:i/>
+            </w:rPr>
+            <w:fldChar w:fldCharType="end"/>
+          </w:r>
+        </w:sdtContent>
+      </w:sdt>
     </w:p>
     <w:p>
       <w:pPr>
@@ -11065,7 +11032,7 @@
                     </pic:cNvPicPr>
                   </pic:nvPicPr>
                   <pic:blipFill>
-                    <a:blip r:embed="rId7">
+                    <a:blip r:embed="rId9">
                       <a:extLst>
                         <a:ext uri="{28A0092B-C50C-407E-A947-70E740481C1C}">
                           <a14:useLocalDpi xmlns:a14="http://schemas.microsoft.com/office/drawing/2010/main" val="0"/>
@@ -11135,7 +11102,7 @@
                     </pic:cNvPicPr>
                   </pic:nvPicPr>
                   <pic:blipFill>
-                    <a:blip r:embed="rId11">
+                    <a:blip r:embed="rId13">
                       <a:extLst>
                         <a:ext uri="{28A0092B-C50C-407E-A947-70E740481C1C}">
                           <a14:useLocalDpi xmlns:a14="http://schemas.microsoft.com/office/drawing/2010/main" val="0"/>
@@ -11212,7 +11179,7 @@
                     </pic:cNvPicPr>
                   </pic:nvPicPr>
                   <pic:blipFill>
-                    <a:blip r:embed="rId12">
+                    <a:blip r:embed="rId14">
                       <a:extLst>
                         <a:ext uri="{28A0092B-C50C-407E-A947-70E740481C1C}">
                           <a14:useLocalDpi xmlns:a14="http://schemas.microsoft.com/office/drawing/2010/main" val="0"/>
@@ -15178,7 +15145,7 @@
                     </pic:cNvPicPr>
                   </pic:nvPicPr>
                   <pic:blipFill>
-                    <a:blip r:embed="rId13">
+                    <a:blip r:embed="rId15">
                       <a:extLst>
                         <a:ext uri="{28A0092B-C50C-407E-A947-70E740481C1C}">
                           <a14:useLocalDpi xmlns:a14="http://schemas.microsoft.com/office/drawing/2010/main" val="0"/>
@@ -18678,7 +18645,7 @@
                     </pic:cNvPicPr>
                   </pic:nvPicPr>
                   <pic:blipFill>
-                    <a:blip r:embed="rId13">
+                    <a:blip r:embed="rId15">
                       <a:extLst>
                         <a:ext uri="{28A0092B-C50C-407E-A947-70E740481C1C}">
                           <a14:useLocalDpi xmlns:a14="http://schemas.microsoft.com/office/drawing/2010/main" val="0"/>
@@ -19894,30 +19861,26 @@
     </w:p>
     <w:p>
       <w:pPr>
+        <w:ind w:firstLine="360"/>
+        <w:jc w:val="both"/>
+      </w:pPr>
+    </w:p>
+    <w:p>
+      <w:pPr>
+        <w:ind w:firstLine="360"/>
+        <w:jc w:val="both"/>
+      </w:pPr>
+    </w:p>
+    <w:p>
+      <w:pPr>
         <w:pStyle w:val="Ttulo2"/>
       </w:pPr>
-      <w:bookmarkStart w:id="63" w:name="_Toc228708109"/>
-      <w:r>
-        <w:t>XVI. Conclusiones</w:t>
-      </w:r>
-      <w:bookmarkEnd w:id="63"/>
-    </w:p>
-    <w:p>
-      <w:pPr>
-        <w:ind w:firstLine="360"/>
-        <w:jc w:val="both"/>
-      </w:pPr>
-    </w:p>
-    <w:p>
-      <w:pPr>
-        <w:pStyle w:val="Ttulo2"/>
-      </w:pPr>
-      <w:bookmarkStart w:id="64" w:name="_Toc228708110"/>
+      <w:bookmarkStart w:id="63" w:name="_Toc228708110"/>
       <w:r>
         <w:lastRenderedPageBreak/>
         <w:t>XVI. Conclusiones</w:t>
       </w:r>
-      <w:bookmarkEnd w:id="64"/>
+      <w:bookmarkEnd w:id="63"/>
     </w:p>
     <w:p>
       <w:pPr>
@@ -20074,11 +20037,11 @@
       <w:pPr>
         <w:pStyle w:val="Ttulo2"/>
       </w:pPr>
-      <w:bookmarkStart w:id="65" w:name="_Toc228708111"/>
+      <w:bookmarkStart w:id="64" w:name="_Toc228708111"/>
       <w:r>
         <w:t>XVII. Referencias</w:t>
       </w:r>
-      <w:bookmarkEnd w:id="65"/>
+      <w:bookmarkEnd w:id="64"/>
     </w:p>
     <w:p>
       <w:pPr>
@@ -20089,6 +20052,10 @@
     <w:sdt>
       <w:sdtPr>
         <w:rPr>
+          <w:rFonts w:ascii="Times New Roman" w:eastAsiaTheme="minorEastAsia" w:hAnsi="Times New Roman" w:cstheme="minorBidi"/>
+          <w:color w:val="auto"/>
+          <w:sz w:val="24"/>
+          <w:szCs w:val="22"/>
           <w:lang w:val="es-MX"/>
         </w:rPr>
         <w:id w:val="-640799907"/>
@@ -20099,10 +20066,6 @@
       </w:sdtPr>
       <w:sdtEndPr>
         <w:rPr>
-          <w:rFonts w:ascii="Times New Roman" w:eastAsiaTheme="minorEastAsia" w:hAnsi="Times New Roman" w:cstheme="minorBidi"/>
-          <w:color w:val="auto"/>
-          <w:sz w:val="24"/>
-          <w:szCs w:val="22"/>
           <w:lang w:val="es-CL"/>
         </w:rPr>
       </w:sdtEndPr>
@@ -20300,6 +20263,39 @@
               </w:r>
             </w:p>
             <w:p>
+              <w:pPr>
+                <w:pStyle w:val="Bibliografa"/>
+                <w:ind w:left="720" w:hanging="720"/>
+                <w:rPr>
+                  <w:noProof/>
+                  <w:lang w:val="es-MX"/>
+                </w:rPr>
+              </w:pPr>
+              <w:r>
+                <w:rPr>
+                  <w:noProof/>
+                  <w:lang w:val="es-MX"/>
+                </w:rPr>
+                <w:t xml:space="preserve">Saint-Exupéry. (1943). El pricipito. En Saint-Exupéry, </w:t>
+              </w:r>
+              <w:r>
+                <w:rPr>
+                  <w:i/>
+                  <w:iCs/>
+                  <w:noProof/>
+                  <w:lang w:val="es-MX"/>
+                </w:rPr>
+                <w:t>El principito.</w:t>
+              </w:r>
+              <w:r>
+                <w:rPr>
+                  <w:noProof/>
+                  <w:lang w:val="es-MX"/>
+                </w:rPr>
+                <w:t xml:space="preserve"> </w:t>
+              </w:r>
+            </w:p>
+            <w:p>
               <w:r>
                 <w:rPr>
                   <w:b/>
@@ -20314,7 +20310,7 @@
     </w:sdt>
     <w:p/>
     <w:sectPr>
-      <w:footerReference w:type="default" r:id="rId14"/>
+      <w:footerReference w:type="default" r:id="rId16"/>
       <w:pgSz w:w="12240" w:h="15840"/>
       <w:pgMar w:top="1440" w:right="1440" w:bottom="1440" w:left="1440" w:header="720" w:footer="720" w:gutter="0"/>
       <w:cols w:space="720"/>
@@ -20322,6 +20318,31 @@
     </w:sectPr>
   </w:body>
 </w:document>
+</file>
+
+<file path=word/endnotes.xml><?xml version="1.0" encoding="utf-8"?>
+<w:endnotes xmlns:wpc="http://schemas.microsoft.com/office/word/2010/wordprocessingCanvas" xmlns:cx="http://schemas.microsoft.com/office/drawing/2014/chartex" xmlns:cx1="http://schemas.microsoft.com/office/drawing/2015/9/8/chartex" xmlns:cx2="http://schemas.microsoft.com/office/drawing/2015/10/21/chartex" xmlns:cx3="http://schemas.microsoft.com/office/drawing/2016/5/9/chartex" xmlns:cx4="http://schemas.microsoft.com/office/drawing/2016/5/10/chartex" xmlns:cx5="http://schemas.microsoft.com/office/drawing/2016/5/11/chartex" xmlns:cx6="http://schemas.microsoft.com/office/drawing/2016/5/12/chartex" xmlns:cx7="http://schemas.microsoft.com/office/drawing/2016/5/13/chartex" xmlns:cx8="http://schemas.microsoft.com/office/drawing/2016/5/14/chartex" xmlns:mc="http://schemas.openxmlformats.org/markup-compatibility/2006" xmlns:aink="http://schemas.microsoft.com/office/drawing/2016/ink" xmlns:am3d="http://schemas.microsoft.com/office/drawing/2017/model3d" xmlns:o="urn:schemas-microsoft-com:office:office" xmlns:oel="http://schemas.microsoft.com/office/2019/extlst" xmlns:r="http://schemas.openxmlformats.org/officeDocument/2006/relationships" xmlns:m="http://schemas.openxmlformats.org/officeDocument/2006/math" xmlns:v="urn:schemas-microsoft-com:vml" xmlns:wp14="http://schemas.microsoft.com/office/word/2010/wordprocessingDrawing" xmlns:wp="http://schemas.openxmlformats.org/drawingml/2006/wordprocessingDrawing" xmlns:w10="urn:schemas-microsoft-com:office:word" xmlns:w="http://schemas.openxmlformats.org/wordprocessingml/2006/main" xmlns:w14="http://schemas.microsoft.com/office/word/2010/wordml" xmlns:w15="http://schemas.microsoft.com/office/word/2012/wordml" xmlns:w16cex="http://schemas.microsoft.com/office/word/2018/wordml/cex" xmlns:w16cid="http://schemas.microsoft.com/office/word/2016/wordml/cid" xmlns:w16="http://schemas.microsoft.com/office/word/2018/wordml" xmlns:w16du="http://schemas.microsoft.com/office/word/2023/wordml/word16du" xmlns:w16sdtdh="http://schemas.microsoft.com/office/word/2020/wordml/sdtdatahash" xmlns:w16sdtfl="http://schemas.microsoft.com/office/word/2024/wordml/sdtformatlock" xmlns:w16se="http://schemas.microsoft.com/office/word/2015/wordml/symex" xmlns:wpg="http://schemas.microsoft.com/office/word/2010/wordprocessingGroup" xmlns:wpi="http://schemas.microsoft.com/office/word/2010/wordprocessingInk" xmlns:wne="http://schemas.microsoft.com/office/word/2006/wordml" xmlns:wps="http://schemas.microsoft.com/office/word/2010/wordprocessingShape" mc:Ignorable="w14 w15 w16se w16cid w16 w16cex w16sdtdh w16sdtfl w16du wp14">
+  <w:endnote w:type="separator" w:id="-1">
+    <w:p>
+      <w:pPr>
+        <w:spacing w:after="0" w:line="240" w:lineRule="auto"/>
+      </w:pPr>
+      <w:r>
+        <w:separator/>
+      </w:r>
+    </w:p>
+  </w:endnote>
+  <w:endnote w:type="continuationSeparator" w:id="0">
+    <w:p>
+      <w:pPr>
+        <w:spacing w:after="0" w:line="240" w:lineRule="auto"/>
+      </w:pPr>
+      <w:r>
+        <w:continuationSeparator/>
+      </w:r>
+    </w:p>
+  </w:endnote>
+</w:endnotes>
 </file>
 
 <file path=word/footer1.xml><?xml version="1.0" encoding="utf-8"?>
@@ -20348,6 +20369,31 @@
     </w:r>
   </w:p>
 </w:ftr>
+</file>
+
+<file path=word/footnotes.xml><?xml version="1.0" encoding="utf-8"?>
+<w:footnotes xmlns:wpc="http://schemas.microsoft.com/office/word/2010/wordprocessingCanvas" xmlns:cx="http://schemas.microsoft.com/office/drawing/2014/chartex" xmlns:cx1="http://schemas.microsoft.com/office/drawing/2015/9/8/chartex" xmlns:cx2="http://schemas.microsoft.com/office/drawing/2015/10/21/chartex" xmlns:cx3="http://schemas.microsoft.com/office/drawing/2016/5/9/chartex" xmlns:cx4="http://schemas.microsoft.com/office/drawing/2016/5/10/chartex" xmlns:cx5="http://schemas.microsoft.com/office/drawing/2016/5/11/chartex" xmlns:cx6="http://schemas.microsoft.com/office/drawing/2016/5/12/chartex" xmlns:cx7="http://schemas.microsoft.com/office/drawing/2016/5/13/chartex" xmlns:cx8="http://schemas.microsoft.com/office/drawing/2016/5/14/chartex" xmlns:mc="http://schemas.openxmlformats.org/markup-compatibility/2006" xmlns:aink="http://schemas.microsoft.com/office/drawing/2016/ink" xmlns:am3d="http://schemas.microsoft.com/office/drawing/2017/model3d" xmlns:o="urn:schemas-microsoft-com:office:office" xmlns:oel="http://schemas.microsoft.com/office/2019/extlst" xmlns:r="http://schemas.openxmlformats.org/officeDocument/2006/relationships" xmlns:m="http://schemas.openxmlformats.org/officeDocument/2006/math" xmlns:v="urn:schemas-microsoft-com:vml" xmlns:wp14="http://schemas.microsoft.com/office/word/2010/wordprocessingDrawing" xmlns:wp="http://schemas.openxmlformats.org/drawingml/2006/wordprocessingDrawing" xmlns:w10="urn:schemas-microsoft-com:office:word" xmlns:w="http://schemas.openxmlformats.org/wordprocessingml/2006/main" xmlns:w14="http://schemas.microsoft.com/office/word/2010/wordml" xmlns:w15="http://schemas.microsoft.com/office/word/2012/wordml" xmlns:w16cex="http://schemas.microsoft.com/office/word/2018/wordml/cex" xmlns:w16cid="http://schemas.microsoft.com/office/word/2016/wordml/cid" xmlns:w16="http://schemas.microsoft.com/office/word/2018/wordml" xmlns:w16du="http://schemas.microsoft.com/office/word/2023/wordml/word16du" xmlns:w16sdtdh="http://schemas.microsoft.com/office/word/2020/wordml/sdtdatahash" xmlns:w16sdtfl="http://schemas.microsoft.com/office/word/2024/wordml/sdtformatlock" xmlns:w16se="http://schemas.microsoft.com/office/word/2015/wordml/symex" xmlns:wpg="http://schemas.microsoft.com/office/word/2010/wordprocessingGroup" xmlns:wpi="http://schemas.microsoft.com/office/word/2010/wordprocessingInk" xmlns:wne="http://schemas.microsoft.com/office/word/2006/wordml" xmlns:wps="http://schemas.microsoft.com/office/word/2010/wordprocessingShape" mc:Ignorable="w14 w15 w16se w16cid w16 w16cex w16sdtdh w16sdtfl w16du wp14">
+  <w:footnote w:type="separator" w:id="-1">
+    <w:p>
+      <w:pPr>
+        <w:spacing w:after="0" w:line="240" w:lineRule="auto"/>
+      </w:pPr>
+      <w:r>
+        <w:separator/>
+      </w:r>
+    </w:p>
+  </w:footnote>
+  <w:footnote w:type="continuationSeparator" w:id="0">
+    <w:p>
+      <w:pPr>
+        <w:spacing w:after="0" w:line="240" w:lineRule="auto"/>
+      </w:pPr>
+      <w:r>
+        <w:continuationSeparator/>
+      </w:r>
+    </w:p>
+  </w:footnote>
+</w:footnotes>
 </file>
 
 <file path=word/numbering.xml><?xml version="1.0" encoding="utf-8"?>
@@ -32961,8 +33007,13 @@
   </w:compat>
   <w:rsids>
     <w:rsidRoot w:val="00B66219"/>
+    <w:rsid w:val="00440885"/>
+    <w:rsid w:val="004D64F0"/>
     <w:rsid w:val="0061619C"/>
+    <w:rsid w:val="007D1227"/>
+    <w:rsid w:val="00AC7AA6"/>
     <w:rsid w:val="00B66219"/>
+    <w:rsid w:val="00C96CC0"/>
     <w:rsid w:val="00CF7810"/>
   </w:rsids>
   <m:mathPr>
@@ -33420,10 +33471,6 @@
   </w:style>
   <w:style w:type="paragraph" w:customStyle="1" w:styleId="7B905C291D864B9799CA7E99F35F44FF">
     <w:name w:val="7B905C291D864B9799CA7E99F35F44FF"/>
-    <w:rsid w:val="00B66219"/>
-  </w:style>
-  <w:style w:type="paragraph" w:customStyle="1" w:styleId="BBE871CF190D4412A59539C846F97BFC">
-    <w:name w:val="BBE871CF190D4412A59539C846F97BFC"/>
     <w:rsid w:val="00B66219"/>
   </w:style>
 </w:styles>
@@ -33858,7 +33905,7 @@
     </b:Author>
     <b:InternetSiteTitle>Github</b:InternetSiteTitle>
     <b:URL>https://github.com/ninogoddess/proyecto-autos/tree/main</b:URL>
-    <b:RefOrder>5</b:RefOrder>
+    <b:RefOrder>6</b:RefOrder>
   </b:Source>
   <b:Source>
     <b:Tag>Aus24</b:Tag>
@@ -33880,11 +33927,36 @@
     <b:URL>https://www.kaggle.com/datasets/austinreese/craigslist-carstrucks-data</b:URL>
     <b:RefOrder>4</b:RefOrder>
   </b:Source>
+  <b:Source>
+    <b:Tag>Sai43</b:Tag>
+    <b:SourceType>BookSection</b:SourceType>
+    <b:Guid>{35FE3BD5-B19A-4968-8420-A1583BAA7D44}</b:Guid>
+    <b:Title>El pricipito</b:Title>
+    <b:Year>1943</b:Year>
+    <b:Author>
+      <b:Author>
+        <b:NameList>
+          <b:Person>
+            <b:Last>Saint-Exupéry</b:Last>
+          </b:Person>
+        </b:NameList>
+      </b:Author>
+      <b:BookAuthor>
+        <b:NameList>
+          <b:Person>
+            <b:Last>Saint-Exupéry</b:Last>
+          </b:Person>
+        </b:NameList>
+      </b:BookAuthor>
+    </b:Author>
+    <b:BookTitle>El principito</b:BookTitle>
+    <b:RefOrder>5</b:RefOrder>
+  </b:Source>
 </b:Sources>
 </file>
 
 <file path=customXml/itemProps1.xml><?xml version="1.0" encoding="utf-8"?>
-<ds:datastoreItem xmlns:ds="http://schemas.openxmlformats.org/officeDocument/2006/customXml" ds:itemID="{5BEB4F97-FFB4-4002-A1B7-1177E1312F28}">
+<ds:datastoreItem xmlns:ds="http://schemas.openxmlformats.org/officeDocument/2006/customXml" ds:itemID="{B6B050E2-4B23-4B88-8F86-3C4F721C27AA}">
   <ds:schemaRefs>
     <ds:schemaRef ds:uri="http://schemas.openxmlformats.org/officeDocument/2006/bibliography"/>
   </ds:schemaRefs>

</xml_diff>